<commit_message>
S1-CL3: reframe the assessment onto Enrolline
Swaps the CL3 assessment system from Ledgerline to Enrolline and reframes the
instruments onto it rather than renaming them. The proportionality argument now
turns on Enrolline's two annual intake windows against fixed census dates; KE 6
becomes a use-versus-depend contrast on object storage, since Enrolline has a
private S3 document store. AT2 needed only the rename — it assesses team
leadership, not the system.

Lab-pack renamed and extended to match the approved design (S3 gateway endpoint,
VPC flow logs, scheduled scaling) with tests for each. Gates 2/4/5/6/8/9/10/11
all pass; cfn-lint clean, 18 lab-pack tests pass.

Co-Authored-By: Claude Opus 5 (1M context) <noreply@anthropic.com>
</commit_message>
<xml_diff>
--- a/S1-CL3-Cloud-Infrastructure-Improvement/assessments/AT1/AT1-Design-Assessor.docx
+++ b/S1-CL3-Cloud-Infrastructure-Improvement/assessments/AT1/AT1-Design-Assessor.docx
@@ -418,7 +418,7 @@
               <w:pStyle w:val="Assessortext"/>
             </w:pPr>
             <w:r>
-              <w:t>Students are assessed on analysing the cloud infrastructure of YAT's Ledgerline accounting system, designing a proportionate improvement to it, and obtaining sign-off to proceed to deployment. AT1 is the first of three assessment tasks in the S1-CL3 Cloud Infrastructure Improvement cluster.</w:t>
+              <w:t>Students are assessed on analysing the cloud infrastructure of YAT's Enrolline student records and enrolment management system, designing a proportionate improvement to it, and obtaining sign-off to proceed to deployment. AT1 is the first of three assessment tasks in the S1-CL3 Cloud Infrastructure Improvement cluster.</w:t>
             </w:r>
           </w:p>
           <w:p>
@@ -521,7 +521,7 @@
               <w:pStyle w:val="Assessortext"/>
             </w:pPr>
             <w:r>
-              <w:t>YAT College's offshore partnership in India has put a spotlight on the systems supporting it. Ledgerline — the finance and office-administration system — was migrated to AWS in an earlier engagement and has run there since, but it was migrated as-is: the whole workload sits in one availability zone and nothing has been revisited since cutover.</w:t>
+              <w:t>YAT College's offshore partnership in India has put a spotlight on the systems supporting it. Enrolline — the finance and office-administration system — was migrated to AWS in an earlier engagement and has run there since, but it was migrated as-is: the whole workload sits in one availability zone and nothing has been revisited since cutover.</w:t>
             </w:r>
           </w:p>
           <w:p>
@@ -529,7 +529,7 @@
               <w:pStyle w:val="Assessortext"/>
             </w:pPr>
             <w:r>
-              <w:t>MTS is engaged to confirm Ledgerline is stable, reliable, fit for purpose and compliant with the Indian regulatory requirements that now apply, and to improve it where it is not. What that improvement consists of is the student's analysis to make.</w:t>
+              <w:t>MTS is engaged to confirm Enrolline is stable, reliable, fit for purpose and compliant with the Indian regulatory requirements that now apply, and to improve it where it is not. What that improvement consists of is the student's analysis to make.</w:t>
             </w:r>
           </w:p>
           <w:p>
@@ -553,7 +553,7 @@
               <w:pStyle w:val="Assessortext"/>
             </w:pPr>
             <w:r>
-              <w:t>MTS scope: cloud infrastructure only. The Ledgerline application and its financial data are out of scope (IR-4), as is legal interpretation of the India obligations — the student designs to the compliance area's determination.</w:t>
+              <w:t>MTS scope: cloud infrastructure only. The Enrolline application and its financial data are out of scope (IR-4), as is legal interpretation of the India obligations — the student designs to the compliance area's determination.</w:t>
             </w:r>
           </w:p>
         </w:tc>
@@ -693,7 +693,7 @@
               <w:pStyle w:val="Assessortext"/>
             </w:pPr>
             <w:r>
-              <w:t>Access to the YAT scenario site / intranet — supplying the Improvement Requirements, the Indian Regulatory Requirements, the Accounting System Infrastructure Specifications, Application Specification and Operational Costing, the baseline design, the network diagram, the reference architectures and the YAT policies. Those documents are linked from the Instructions to Student below</w:t>
+              <w:t>Access to the YAT scenario site / intranet — supplying the Improvement Requirements, the Indian Regulatory Requirements, the Enrolline Infrastructure Specifications, Application Specification and Operational Costing, the baseline design, the network diagram, the reference architectures and the YAT policies. Those documents are linked from the Instructions to Student below</w:t>
             </w:r>
           </w:p>
           <w:p>
@@ -1368,7 +1368,7 @@
           </w:tcPr>
           <w:p>
             <w:r>
-              <w:t>D12 Knowledge (questions 1–3) — industry standards and standard products in the student's own design, where object storage is and is not the right answer, and what cloud adoption changed for Ledgerline</w:t>
+              <w:t>D12 Knowledge (questions 1–3) — industry standards and standard products in the student's own design, where object storage is and is not the right answer, and what cloud adoption changed for Enrolline</w:t>
             </w:r>
           </w:p>
           <w:p>
@@ -1416,7 +1416,7 @@
           <w:i w:val="0"/>
           <w:sz w:val="21"/>
         </w:rPr>
-        <w:t>YAT College's offshore partnership in India has put a spotlight on the systems that support it. Ledgerline — YAT's finance and office-administration system — was migrated to AWS in an earlier engagement and has run there since, but it was migrated as-is: everything sits in one availability zone, and nothing has been revisited since the cutover.</w:t>
+        <w:t>YAT College's offshore partnership in India has put a spotlight on the systems that support it. Enrolline — YAT's student records and enrolment management system — was migrated to AWS in an earlier engagement and has run there since, but it was migrated as-is: everything sits in one availability zone, and nothing has been revisited since the cutover.</w:t>
       </w:r>
     </w:p>
     <w:p>
@@ -1429,7 +1429,7 @@
           <w:i w:val="0"/>
           <w:sz w:val="21"/>
         </w:rPr>
-        <w:t>You are an MTS Consultant on this engagement, reporting to Pat Lin (MTS Senior Consultant). Sam Walker (YAT ICT Manager) is your primary stakeholder, with YAT Finance as the business owner of the system.</w:t>
+        <w:t>Enrolline holds the enrolment record, student identity and USI, results, student fee invoicing and receipting, and the data YAT reports to NCVER. It is staff-facing — admissions, student services, faculty administration and compliance use it, and students hold no accounts. It is not the LMS, which delivers teaching, and it is not Ledgerline, which is the general ledger; Enrolline provisions students into the former and posts fee summaries to the latter.</w:t>
       </w:r>
     </w:p>
     <w:p>
@@ -1442,7 +1442,20 @@
           <w:i w:val="0"/>
           <w:sz w:val="21"/>
         </w:rPr>
-        <w:t>MTS has been engaged to confirm Ledgerline is stable, reliable, fit for purpose and compliant with the Indian regulatory requirements that now apply — and to improve it where it is not. What that improvement consists of is your analysis to make.</w:t>
+        <w:t>You are an MTS Consultant on this engagement, reporting to Pat Lin (MTS Senior Consultant). Sam Walker (YAT ICT Manager) is your primary stakeholder, with Jess Tran (YAT Registrar) as the business owner of the system.</w:t>
+      </w:r>
+    </w:p>
+    <w:p>
+      <w:pPr>
+        <w:spacing w:after="160"/>
+      </w:pPr>
+      <w:r>
+        <w:rPr>
+          <w:b w:val="0"/>
+          <w:i w:val="0"/>
+          <w:sz w:val="21"/>
+        </w:rPr>
+        <w:t>MTS has been engaged to confirm Enrolline is stable, reliable, fit for purpose and compliant with the Indian regulatory requirements that now apply — and to improve it where it is not. What that improvement consists of is your analysis to make.</w:t>
       </w:r>
     </w:p>
     <w:p>
@@ -1515,7 +1528,7 @@
             <w:color w:val="0563C1"/>
             <w:u w:val="single"/>
           </w:rPr>
-          <w:t>Accounting System Infrastructure Specifications — the current as-built environment</w:t>
+          <w:t>Enrolline Infrastructure Specifications — the current as-built environment</w:t>
         </w:r>
       </w:hyperlink>
     </w:p>
@@ -1537,7 +1550,7 @@
             <w:color w:val="0563C1"/>
             <w:u w:val="single"/>
           </w:rPr>
-          <w:t>Accounting System Application Specification — the workload, its users and its patterns</w:t>
+          <w:t>Enrolline Application Specification — the workload, its users and its patterns</w:t>
         </w:r>
       </w:hyperlink>
     </w:p>
@@ -1559,7 +1572,7 @@
             <w:color w:val="0563C1"/>
             <w:u w:val="single"/>
           </w:rPr>
-          <w:t>Accounting System Operational Costing — what the environment costs to run today</w:t>
+          <w:t>Enrolline Operational Costing — what the environment costs to run today</w:t>
         </w:r>
       </w:hyperlink>
     </w:p>
@@ -1643,7 +1656,20 @@
           <w:i w:val="0"/>
           <w:sz w:val="21"/>
         </w:rPr>
-        <w:t>There is no right answer waiting to be found. The Improvement Requirements are outcomes, not solutions, and IR-2 asks for improvements proportionate to an internal, business-hours finance system. Proposing every improvement available is not a better answer than proposing three you can justify — it is a worse one.</w:t>
+        <w:t>There is no right answer waiting to be found. The Improvement Requirements are outcomes, not solutions, and IR-2 asks for improvements proportionate to what this system actually is. Proposing every improvement available is not a better answer than proposing three you can justify — it is a worse one.</w:t>
+      </w:r>
+    </w:p>
+    <w:p>
+      <w:pPr>
+        <w:spacing w:after="160"/>
+      </w:pPr>
+      <w:r>
+        <w:rPr>
+          <w:b w:val="0"/>
+          <w:i w:val="0"/>
+          <w:sz w:val="21"/>
+        </w:rPr>
+        <w:t>Be careful what you take 'proportionate' to mean here. Enrolline is a staff-facing system that is idle overnight and quiet for most of the year — and for about six weeks of it, during the intake enrolment windows and census processing, the business cannot function without it and the deadlines are fixed outside YAT's control. Both of those are true at once. An answer that sizes the whole year to the quiet weeks, and an answer that sizes it to the busy ones, can each be defended; what cannot be defended is not noticing the difference.</w:t>
       </w:r>
     </w:p>
     <w:p>
@@ -1794,7 +1820,7 @@
                 <w:b w:val="0"/>
                 <w:sz w:val="19"/>
               </w:rPr>
-              <w:t>Ledgerline Finance &amp; Office Suite — general ledger, accounts payable and receivable, student fee billing, procurement and asset management. Internal back-office system; payroll is outsourced and does not run here.</w:t>
+              <w:t>Enrolline Student Management Suite — applications and offers, enrolment, student identity and USI verification, results, student fee invoicing and receipting, and AVETMISS compliance reporting. Staff-facing back-office system; students hold no accounts and submit applications through the public website.</w:t>
             </w:r>
           </w:p>
         </w:tc>
@@ -1837,7 +1863,7 @@
                 <w:b w:val="0"/>
                 <w:sz w:val="19"/>
               </w:rPr>
-              <w:t>internal only — staff reach it from campus over the Site-to-Site VPN. No public ingress.</w:t>
+              <w:t>reached through the load balancer over HTTP. A production front door for a student-records system would sit behind TLS and restricted ingress; this baseline stops short of that.</w:t>
             </w:r>
           </w:p>
         </w:tc>
@@ -1880,7 +1906,7 @@
                 <w:b w:val="0"/>
                 <w:sz w:val="19"/>
               </w:rPr>
-              <w:t>Amazon Linux on general-purpose burstable instances, in an Auto Scaling group with min 1 / desired 1 / max 2, in ledgerline-app-a only; target tracking on CPU at 70%</w:t>
+              <w:t>Amazon Linux on general-purpose burstable instances, in an Auto Scaling group with min 1 / desired 1 / max 2, in enrolline-app-a only; target tracking on CPU at 70%</w:t>
             </w:r>
           </w:p>
         </w:tc>
@@ -1923,7 +1949,7 @@
                 <w:b w:val="0"/>
                 <w:sz w:val="19"/>
               </w:rPr>
-              <w:t>Application Load Balancer across ledgerline-public-a and -b (a load balancer requires two zones), HTTP :80 to ledgerline-tg</w:t>
+              <w:t>Application Load Balancer across enrolline-public-a and -b (a load balancer requires two zones), HTTP :80 to enrolline-tg</w:t>
             </w:r>
           </w:p>
         </w:tc>
@@ -1966,7 +1992,7 @@
                 <w:b w:val="0"/>
                 <w:sz w:val="19"/>
               </w:rPr>
-              <w:t>Amazon RDS for PostgreSQL, single-AZ with no standby, gp3 20 GB, encrypted, 7-day backup retention, in ledgerline-data-a</w:t>
+              <w:t>Amazon RDS for PostgreSQL, single-AZ with no standby, gp3 20 GB, encrypted, 7-day backup retention, in enrolline-data-a</w:t>
             </w:r>
           </w:p>
         </w:tc>
@@ -2009,7 +2035,7 @@
                 <w:b w:val="0"/>
                 <w:sz w:val="19"/>
               </w:rPr>
-              <w:t>block storage only — the instance root volume and the database storage. No object storage is in use.</w:t>
+              <w:t>block storage for the instance root volume and the database, plus an Amazon S3 document store (yat-enrolline-documents) holding scanned student attachments — ID evidence, prior qualifications, USI evidence, support plans. ~26 GB, growing ~6 GB a year, versioned, encrypted, public access blocked, and no lifecycle configuration. Reached through the NAT gateway; there is no S3 VPC endpoint.</w:t>
             </w:r>
           </w:p>
         </w:tc>
@@ -2052,7 +2078,7 @@
                 <w:b w:val="0"/>
                 <w:sz w:val="19"/>
               </w:rPr>
-              <w:t>ledgerline-vpc 10.20.0.0/16; public-a/-b, app-a, data-a/-b; a single NAT gateway in ledgerline-public-a</w:t>
+              <w:t>enrolline-vpc 10.30.0.0/16; public-a/-b, app-a, data-a/-b; a single NAT gateway in enrolline-public-a. No VPC endpoints. No flow logs, no load-balancer access logs and no S3 access logging are configured.</w:t>
             </w:r>
           </w:p>
         </w:tc>
@@ -2095,7 +2121,7 @@
                 <w:b w:val="0"/>
                 <w:sz w:val="19"/>
               </w:rPr>
-              <w:t>ledgerline-alb-sg  HTTP 80 from anywhere  ·  ledgerline-app-sg  from the load balancer group  ·  ledgerline-db-sg  PostgreSQL 5432 from the app group only</w:t>
+              <w:t>enrolline-alb-sg  HTTP 80 from anywhere  ·  enrolline-app-sg  from the load balancer group  ·  enrolline-db-sg  PostgreSQL 5432 from the app group only</w:t>
             </w:r>
           </w:p>
         </w:tc>
@@ -2138,7 +2164,7 @@
                 <w:b w:val="0"/>
                 <w:sz w:val="19"/>
               </w:rPr>
-              <w:t>two alarms — ledgerline-unhealthy-hosts (any unhealthy target) and ledgerline-db-storage-low (free storage below 15%)</w:t>
+              <w:t>two alarms — enrolline-unhealthy-hosts (any unhealthy target) and enrolline-db-storage-low (free storage below 15%)</w:t>
             </w:r>
           </w:p>
         </w:tc>
@@ -2181,7 +2207,7 @@
                 <w:b w:val="0"/>
                 <w:sz w:val="19"/>
               </w:rPr>
-              <w:t>business hours only, Monday to Friday, roughly 07:30–18:00; effectively idle overnight and at weekends. Month-end close is the monthly peak at 45–55 concurrent users; end of financial year is the annual peak.</w:t>
+              <w:t>business hours only, Monday to Friday, roughly 08:00–18:00; effectively idle overnight and at weekends. Out of intake it carries 25–40 concurrent users. During an intake enrolment window — the first three weeks of February and of July — that rises to 90–110 and stays there; census processing about four weeks later is a second, shorter spike. The application tier is provisioned for that peak and held at that size all year.</w:t>
             </w:r>
           </w:p>
         </w:tc>
@@ -2224,7 +2250,7 @@
                 <w:b w:val="0"/>
                 <w:sz w:val="19"/>
               </w:rPr>
-              <w:t>99.5% business-hours service</w:t>
+              <w:t>99.5% business-hours service; the Registrar expects 99.9% during an intake enrolment window, because enrolment and census dates are fixed externally and work missed inside the window cannot be made up later</w:t>
             </w:r>
           </w:p>
         </w:tc>
@@ -2306,7 +2332,7 @@
           <w:color w:val="6B6660"/>
           <w:sz w:val="19"/>
         </w:rPr>
-        <w:t>Your work is the cloud infrastructure. The Ledgerline application and its financial data are out of scope (IR-4) — the application continues to run unchanged, and no financial data may be lost.</w:t>
+        <w:t>Your work is the cloud infrastructure. The Enrolline application and its student data are out of scope (IR-4) — the application continues to run unchanged, and no student record may be lost or altered. Student and assessment records carry a thirty-year retention obligation and are the evidence that a qualification was legitimately issued.</w:t>
       </w:r>
     </w:p>
     <w:p>
@@ -2328,7 +2354,7 @@
           <w:color w:val="C5613B"/>
           <w:sz w:val="19"/>
         </w:rPr>
-        <w:t>Instance and database classes throughout this environment are sized to what will actually launch in an AWS Academy Learner Lab, which caps what is available. Ledgerline's real finance workload would warrant considerably larger. Reason about sizing as you would at full scale — the reasoning is what is assessed, not the vCPU count.</w:t>
+        <w:t>Instance and database classes throughout this environment are sized to what will actually launch in an AWS Academy Learner Lab, which caps what is available. Enrolline's real intake-window load would warrant considerably larger. Reason about sizing as you would at full scale — the reasoning is what is assessed, not the vCPU count.</w:t>
       </w:r>
     </w:p>
     <w:p>
@@ -2399,7 +2425,7 @@
             <w:color w:val="0563C1"/>
             <w:u w:val="single"/>
           </w:rPr>
-          <w:t>Accounting System Infrastructure Specifications — the environment tier by tier</w:t>
+          <w:t>Enrolline Infrastructure Specifications — the environment tier by tier</w:t>
         </w:r>
       </w:hyperlink>
     </w:p>
@@ -2421,7 +2447,7 @@
             <w:color w:val="0563C1"/>
             <w:u w:val="single"/>
           </w:rPr>
-          <w:t>Accounting System Cloud Architecture — Baseline Design — how it was designed at migration, and why</w:t>
+          <w:t>Enrolline Cloud Architecture — Baseline Design — how it was designed at migration, and why</w:t>
         </w:r>
       </w:hyperlink>
     </w:p>
@@ -3028,7 +3054,7 @@
           <w:i w:val="0"/>
           <w:sz w:val="21"/>
         </w:rPr>
-        <w:t>Now evaluate it. For each design decision from task 1, say what it means for the business — not what it means technically. 'Single availability zone' is a fact; 'a zone failure stops month-end close and finance cannot pay suppliers' is a business impact.</w:t>
+        <w:t>Now evaluate it. For each design decision from task 1, say what it means for the business — not what it means technically. 'Single availability zone' is a fact; 'a zone failure stops enrolment processing and students cannot be enrolled before census' is a business impact.</w:t>
       </w:r>
     </w:p>
     <w:p>
@@ -3062,7 +3088,7 @@
             <w:color w:val="0563C1"/>
             <w:u w:val="single"/>
           </w:rPr>
-          <w:t>Accounting System Application Specification — who uses it, when, and how heavily</w:t>
+          <w:t>Enrolline Application Specification — who uses it, when, and how heavily</w:t>
         </w:r>
       </w:hyperlink>
     </w:p>
@@ -3201,27 +3227,27 @@
                 <w:color w:val="1F5A5C"/>
                 <w:sz w:val="18"/>
               </w:rPr>
-              <w:t>a zone failure takes finance offline until it is rebuilt elsewhere; during month-end close that stops supplier payments and billing</w:t>
-            </w:r>
-          </w:p>
-        </w:tc>
-        <w:tc>
-          <w:tcPr>
-            <w:tcW w:type="dxa" w:w="3489"/>
-            <w:tcBorders>
-              <w:top w:val="single" w:sz="4" w:space="0" w:color="E4DED3"/>
-              <w:left w:val="single" w:sz="4" w:space="0" w:color="E4DED3"/>
-              <w:bottom w:val="single" w:sz="4" w:space="0" w:color="E4DED3"/>
-              <w:right w:val="single" w:sz="4" w:space="0" w:color="E4DED3"/>
-            </w:tcBorders>
-          </w:tcPr>
-          <w:p>
-            <w:r>
-              <w:rPr>
-                <w:color w:val="1F5A5C"/>
-                <w:sz w:val="18"/>
-              </w:rPr>
-              <w:t>significant, but bounded by business hours</w:t>
+              <w:t>a zone failure takes admissions and student services offline until it is rebuilt elsewhere; inside an intake enrolment window that stops enrolment against a census date that cannot be moved</w:t>
+            </w:r>
+          </w:p>
+        </w:tc>
+        <w:tc>
+          <w:tcPr>
+            <w:tcW w:type="dxa" w:w="3489"/>
+            <w:tcBorders>
+              <w:top w:val="single" w:sz="4" w:space="0" w:color="E4DED3"/>
+              <w:left w:val="single" w:sz="4" w:space="0" w:color="E4DED3"/>
+              <w:bottom w:val="single" w:sz="4" w:space="0" w:color="E4DED3"/>
+              <w:right w:val="single" w:sz="4" w:space="0" w:color="E4DED3"/>
+            </w:tcBorders>
+          </w:tcPr>
+          <w:p>
+            <w:r>
+              <w:rPr>
+                <w:color w:val="1F5A5C"/>
+                <w:sz w:val="18"/>
+              </w:rPr>
+              <w:t>bounded by business hours, but severe inside an intake window</w:t>
             </w:r>
           </w:p>
         </w:tc>
@@ -3449,7 +3475,7 @@
                 <w:color w:val="1F5A5C"/>
                 <w:sz w:val="18"/>
               </w:rPr>
-              <w:t>finance data crosses the campus network unencrypted</w:t>
+              <w:t>student data crosses the campus network unencrypted</w:t>
             </w:r>
           </w:p>
         </w:tc>
@@ -3570,7 +3596,7 @@
           <w:color w:val="6B6660"/>
           <w:sz w:val="18"/>
         </w:rPr>
-        <w:t>impacts are expressed in business terms and are proportionate to what Ledgerline actually is — an internal, business-hours system with outsourced payroll and a 99.5% target. A student who describes a zone outage as catastrophic for a system that is idle overnight and at weekends has not evaluated it against the business; neither has one who dismisses it because the system is 'only internal'. PC 1.2 is about the impact of DESIGN DECISIONS, so each row must trace to one.</w:t>
+        <w:t>impacts are expressed in business terms and are proportionate to what Enrolline actually is — a staff-facing system, idle overnight and at weekends, quiet for most of the year, and business-critical for about six weeks of it. A student who describes a zone outage as uniformly catastrophic has not evaluated it against the business; neither has one who dismisses it because the system is 'only internal' and so misses that census dates are externally fixed. The strongest answers say WHEN the impact bites. PC 1.2 is about the impact of DESIGN DECISIONS, so each row must trace to one.</w:t>
       </w:r>
     </w:p>
     <w:p>
@@ -4192,7 +4218,7 @@
           <w:color w:val="6B6660"/>
           <w:sz w:val="18"/>
         </w:rPr>
-        <w:t>the student works from the supplied determination rather than reasoning about the law themselves, identifies the gaps that actually apply to an internal finance system, and proposes infrastructure changes rather than policy. A student who advises on the legal position has stepped outside the engagement's scope, which the Role Brief and IR-3 both set explicitly.</w:t>
+        <w:t>the student works from the supplied determination rather than reasoning about the law themselves, identifies the gaps that actually apply to an internal student records system, and proposes infrastructure changes rather than policy. A student who advises on the legal position has stepped outside the engagement's scope, which the Role Brief and IR-3 both set explicitly.</w:t>
       </w:r>
     </w:p>
     <w:p>
@@ -4628,7 +4654,7 @@
                 <w:color w:val="1F5A5C"/>
                 <w:sz w:val="18"/>
               </w:rPr>
-              <w:t>protects finance data in transit</w:t>
+              <w:t>protects student data in transit</w:t>
             </w:r>
           </w:p>
         </w:tc>
@@ -4848,7 +4874,7 @@
           <w:i w:val="0"/>
           <w:sz w:val="21"/>
         </w:rPr>
-        <w:t>Determine and assess what the options from task 4 actually give YAT, against the way this business runs. Ledgerline is used by finance staff during business hours and is idle the rest of the time — that shapes what an improvement is worth. Say what each option costs and what it buys.</w:t>
+        <w:t>Determine and assess what the options from task 4 actually give YAT, against the way this business runs. Enrolline is used by admissions, student services and faculty administration during business hours and is idle the rest of the time — and its load is concentrated into two intake windows a year. That shapes what an improvement is worth. Say what each option costs and what it buys.</w:t>
       </w:r>
     </w:p>
     <w:p>
@@ -4882,7 +4908,7 @@
             <w:color w:val="0563C1"/>
             <w:u w:val="single"/>
           </w:rPr>
-          <w:t>Accounting System Operational Costing — what this environment costs today</w:t>
+          <w:t>Enrolline Operational Costing — what this environment costs today</w:t>
         </w:r>
       </w:hyperlink>
     </w:p>
@@ -5019,7 +5045,7 @@
                 <w:color w:val="1F5A5C"/>
                 <w:sz w:val="18"/>
               </w:rPr>
-              <w:t>removes the zone and instance exposure; matters most during month-end close</w:t>
+              <w:t>removes the zone and instance exposure; matters most inside an intake window</w:t>
             </w:r>
           </w:p>
         </w:tc>
@@ -5267,7 +5293,7 @@
                 <w:color w:val="1F5A5C"/>
                 <w:sz w:val="18"/>
               </w:rPr>
-              <w:t>finance data encrypted in transit; the cheapest improvement on this list</w:t>
+              <w:t>student data encrypted in transit; the cheapest improvement on this list</w:t>
             </w:r>
           </w:p>
         </w:tc>
@@ -5368,7 +5394,7 @@
           <w:color w:val="6B6660"/>
           <w:sz w:val="18"/>
         </w:rPr>
-        <w:t>each option carries a cost posture and a benefit stated against Ledgerline's actual operating profile. The strongest answers notice that an idle-overnight, business-hours system changes the value of always-on redundancy, and that some cloud benefits (elasticity) matter less here than others (managed recovery). KE 3 and KE 5 are evidenced by the student reasoning about what cloud adoption and migration bring to THIS system rather than in general.</w:t>
+        <w:t>each option carries a cost posture and a benefit stated against Enrolline's actual operating profile. The strongest answers notice that an idle-overnight system changes the value of always-on redundancy, that an improvement's worth may differ sharply between intake weeks and the rest of the year, and that some cloud benefits matter more here than others — elasticity is worth a great deal to a workload with two known annual peaks, which is a different argument from the one a flat workload would make. KE 3 and KE 5 are evidenced by the student reasoning about what cloud adoption and migration bring to THIS system rather than in general.</w:t>
       </w:r>
     </w:p>
     <w:p>
@@ -5576,7 +5602,7 @@
                 <w:color w:val="1F5A5C"/>
                 <w:sz w:val="18"/>
               </w:rPr>
-              <w:t>a zone or instance failure should not stop finance; overnight outages cost nothing</w:t>
+              <w:t>a zone or instance failure should not stop enrolment; overnight outages cost nothing, and the Registrar already expects 99.9% inside an intake window</w:t>
             </w:r>
           </w:p>
         </w:tc>
@@ -5618,27 +5644,27 @@
                 <w:color w:val="1F5A5C"/>
                 <w:sz w:val="18"/>
               </w:rPr>
-              <w:t>restore service within 4 hours, losing no more than 1 hour of financial data</w:t>
-            </w:r>
-          </w:p>
-        </w:tc>
-        <w:tc>
-          <w:tcPr>
-            <w:tcW w:type="dxa" w:w="3489"/>
-            <w:tcBorders>
-              <w:top w:val="single" w:sz="4" w:space="0" w:color="E4DED3"/>
-              <w:left w:val="single" w:sz="4" w:space="0" w:color="E4DED3"/>
-              <w:bottom w:val="single" w:sz="4" w:space="0" w:color="E4DED3"/>
-              <w:right w:val="single" w:sz="4" w:space="0" w:color="E4DED3"/>
-            </w:tcBorders>
-          </w:tcPr>
-          <w:p>
-            <w:r>
-              <w:rPr>
-                <w:color w:val="1F5A5C"/>
-                <w:sz w:val="18"/>
-              </w:rPr>
-              <w:t>a business day is the unit that matters; financial records cannot be lost</w:t>
+              <w:t>restore service within 4 hours, losing no more than 1 hour of student records</w:t>
+            </w:r>
+          </w:p>
+        </w:tc>
+        <w:tc>
+          <w:tcPr>
+            <w:tcW w:type="dxa" w:w="3489"/>
+            <w:tcBorders>
+              <w:top w:val="single" w:sz="4" w:space="0" w:color="E4DED3"/>
+              <w:left w:val="single" w:sz="4" w:space="0" w:color="E4DED3"/>
+              <w:bottom w:val="single" w:sz="4" w:space="0" w:color="E4DED3"/>
+              <w:right w:val="single" w:sz="4" w:space="0" w:color="E4DED3"/>
+            </w:tcBorders>
+          </w:tcPr>
+          <w:p>
+            <w:r>
+              <w:rPr>
+                <w:color w:val="1F5A5C"/>
+                <w:sz w:val="18"/>
+              </w:rPr>
+              <w:t>a business day is the unit that matters; student records cannot be lost</w:t>
             </w:r>
           </w:p>
         </w:tc>
@@ -5680,7 +5706,7 @@
                 <w:color w:val="1F5A5C"/>
                 <w:sz w:val="18"/>
               </w:rPr>
-              <w:t>no finance data in transit unencrypted</w:t>
+              <w:t>no student data in transit unencrypted</w:t>
             </w:r>
           </w:p>
         </w:tc>
@@ -5804,7 +5830,7 @@
                 <w:color w:val="1F5A5C"/>
                 <w:sz w:val="18"/>
               </w:rPr>
-              <w:t>month-end close performance no worse than today</w:t>
+              <w:t>intake-window performance no worse than today</w:t>
             </w:r>
           </w:p>
         </w:tc>
@@ -5863,7 +5889,7 @@
           <w:color w:val="6B6660"/>
           <w:sz w:val="18"/>
         </w:rPr>
-        <w:t>a goal is set in each of the four areas, each measurable and each defensible against Ledgerline's profile. 'Improve reliability' is not a goal; 'business-hours availability of 99.9%, up from 99.5%' is. PE 3 requires the student to determine metrics AND business goals, so the pairing must be visible. Goals wildly beyond the system's need (99.99% for a business-hours finance system) fail IR-2 and should be marked as not proportionate.</w:t>
+        <w:t>a goal is set in each of the four areas, each measurable and each defensible against Enrolline's profile. 'Improve reliability' is not a goal; 'business-hours availability of 99.9%, up from 99.5%' is. PE 3 requires the student to determine metrics AND business goals, so the pairing must be visible. Goals wildly beyond the system's need (99.99% for a staff-facing student records system) fail IR-2 and should be marked as not proportionate.</w:t>
       </w:r>
     </w:p>
     <w:p>
@@ -6097,7 +6123,7 @@
                 <w:color w:val="1F5A5C"/>
                 <w:sz w:val="18"/>
               </w:rPr>
-              <w:t>the security goal — finance data encrypted in transit</w:t>
+              <w:t>the security goal — student data encrypted in transit</w:t>
             </w:r>
           </w:p>
         </w:tc>
@@ -6325,27 +6351,27 @@
                 <w:color w:val="1F5A5C"/>
                 <w:sz w:val="18"/>
               </w:rPr>
-              <w:t>a second region</w:t>
-            </w:r>
-          </w:p>
-        </w:tc>
-        <w:tc>
-          <w:tcPr>
-            <w:tcW w:type="dxa" w:w="3489"/>
-            <w:tcBorders>
-              <w:top w:val="single" w:sz="4" w:space="0" w:color="E4DED3"/>
-              <w:left w:val="single" w:sz="4" w:space="0" w:color="E4DED3"/>
-              <w:bottom w:val="single" w:sz="4" w:space="0" w:color="E4DED3"/>
-              <w:right w:val="single" w:sz="4" w:space="0" w:color="E4DED3"/>
-            </w:tcBorders>
-          </w:tcPr>
-          <w:p>
-            <w:r>
-              <w:rPr>
-                <w:color w:val="1F5A5C"/>
-                <w:sz w:val="18"/>
-              </w:rPr>
-              <w:t>far beyond an internal business-hours system; fails IR-2</w:t>
+              <w:t>a second region for the whole system</w:t>
+            </w:r>
+          </w:p>
+        </w:tc>
+        <w:tc>
+          <w:tcPr>
+            <w:tcW w:type="dxa" w:w="3489"/>
+            <w:tcBorders>
+              <w:top w:val="single" w:sz="4" w:space="0" w:color="E4DED3"/>
+              <w:left w:val="single" w:sz="4" w:space="0" w:color="E4DED3"/>
+              <w:bottom w:val="single" w:sz="4" w:space="0" w:color="E4DED3"/>
+              <w:right w:val="single" w:sz="4" w:space="0" w:color="E4DED3"/>
+            </w:tcBorders>
+          </w:tcPr>
+          <w:p>
+            <w:r>
+              <w:rPr>
+                <w:color w:val="1F5A5C"/>
+                <w:sz w:val="18"/>
+              </w:rPr>
+              <w:t>beyond what a staff-facing system with a two-hour recovery objective needs; fails IR-2. Note this is separate from the India log residency, which IR-3 requires</w:t>
             </w:r>
           </w:p>
         </w:tc>
@@ -6407,7 +6433,7 @@
                 <w:color w:val="1F5A5C"/>
                 <w:sz w:val="18"/>
               </w:rPr>
-              <w:t>capacity is not the constraint — the specifications say so</w:t>
+              <w:t>capacity is not the constraint — the specifications say so. The question is when the capacity runs, not how big it is</w:t>
             </w:r>
           </w:p>
         </w:tc>
@@ -6446,7 +6472,7 @@
           <w:color w:val="6B6660"/>
           <w:sz w:val="18"/>
         </w:rPr>
-        <w:t>the student commits to a proportionate set and can defend the exclusions. There is no correct set: converting the database to a standby is defensible on the recovery goal, and so is leaving it single-AZ with a tested restore if the cost is argued against a business-hours system. What fails PC 1.5 is a proposal set with no rejected options beside it, or one whose items do not trace to a task 6 goal.</w:t>
+        <w:t>the student commits to a proportionate set and can defend the exclusions. There is no correct set: converting the database to a standby is defensible on the recovery goal, and so is leaving it single-AZ with a tested restore if the cost is argued — though that argument is harder here than it looks, because the restore has to complete inside an intake window against a census date nobody at YAT can move. Either position can pass; a student who reaches the cheaper one without confronting the census constraint has not made the argument. What fails PC 1.5 is a proposal set with no rejected options beside it, or one whose items do not trace to a task 6 goal.</w:t>
       </w:r>
     </w:p>
     <w:p>
@@ -8649,47 +8675,47 @@
                 <w:color w:val="1F5A5C"/>
                 <w:sz w:val="18"/>
               </w:rPr>
-              <w:t>Scalability at month-end</w:t>
-            </w:r>
-          </w:p>
-        </w:tc>
-        <w:tc>
-          <w:tcPr>
-            <w:tcW w:type="dxa" w:w="3489"/>
-            <w:tcBorders>
-              <w:top w:val="single" w:sz="4" w:space="0" w:color="E4DED3"/>
-              <w:left w:val="single" w:sz="4" w:space="0" w:color="E4DED3"/>
-              <w:bottom w:val="single" w:sz="4" w:space="0" w:color="E4DED3"/>
-              <w:right w:val="single" w:sz="4" w:space="0" w:color="E4DED3"/>
-            </w:tcBorders>
-          </w:tcPr>
-          <w:p>
-            <w:r>
-              <w:rPr>
-                <w:color w:val="1F5A5C"/>
-                <w:sz w:val="18"/>
-              </w:rPr>
-              <w:t>existing target tracking, maximum raised</w:t>
-            </w:r>
-          </w:p>
-        </w:tc>
-        <w:tc>
-          <w:tcPr>
-            <w:tcW w:type="dxa" w:w="3489"/>
-            <w:tcBorders>
-              <w:top w:val="single" w:sz="4" w:space="0" w:color="E4DED3"/>
-              <w:left w:val="single" w:sz="4" w:space="0" w:color="E4DED3"/>
-              <w:bottom w:val="single" w:sz="4" w:space="0" w:color="E4DED3"/>
-              <w:right w:val="single" w:sz="4" w:space="0" w:color="E4DED3"/>
-            </w:tcBorders>
-          </w:tcPr>
-          <w:p>
-            <w:r>
-              <w:rPr>
-                <w:color w:val="1F5A5C"/>
-                <w:sz w:val="18"/>
-              </w:rPr>
-              <w:t>the group scales to absorb the close; unchanged in mechanism</w:t>
+              <w:t>Scalability at intake</w:t>
+            </w:r>
+          </w:p>
+        </w:tc>
+        <w:tc>
+          <w:tcPr>
+            <w:tcW w:type="dxa" w:w="3489"/>
+            <w:tcBorders>
+              <w:top w:val="single" w:sz="4" w:space="0" w:color="E4DED3"/>
+              <w:left w:val="single" w:sz="4" w:space="0" w:color="E4DED3"/>
+              <w:bottom w:val="single" w:sz="4" w:space="0" w:color="E4DED3"/>
+              <w:right w:val="single" w:sz="4" w:space="0" w:color="E4DED3"/>
+            </w:tcBorders>
+          </w:tcPr>
+          <w:p>
+            <w:r>
+              <w:rPr>
+                <w:color w:val="1F5A5C"/>
+                <w:sz w:val="18"/>
+              </w:rPr>
+              <w:t>existing target tracking, maximum raised, capacity scheduled against the published academic calendar</w:t>
+            </w:r>
+          </w:p>
+        </w:tc>
+        <w:tc>
+          <w:tcPr>
+            <w:tcW w:type="dxa" w:w="3489"/>
+            <w:tcBorders>
+              <w:top w:val="single" w:sz="4" w:space="0" w:color="E4DED3"/>
+              <w:left w:val="single" w:sz="4" w:space="0" w:color="E4DED3"/>
+              <w:bottom w:val="single" w:sz="4" w:space="0" w:color="E4DED3"/>
+              <w:right w:val="single" w:sz="4" w:space="0" w:color="E4DED3"/>
+            </w:tcBorders>
+          </w:tcPr>
+          <w:p>
+            <w:r>
+              <w:rPr>
+                <w:color w:val="1F5A5C"/>
+                <w:sz w:val="18"/>
+              </w:rPr>
+              <w:t>the peaks are known months ahead, so capacity can be in place before the load arrives rather than chased after users are already queuing</w:t>
             </w:r>
           </w:p>
         </w:tc>
@@ -8880,27 +8906,27 @@
                 <w:color w:val="1F5A5C"/>
                 <w:sz w:val="18"/>
               </w:rPr>
-              <w:t>the tier scales down outside business hours; the system is idle overnight</w:t>
-            </w:r>
-          </w:p>
-        </w:tc>
-        <w:tc>
-          <w:tcPr>
-            <w:tcW w:type="dxa" w:w="3489"/>
-            <w:tcBorders>
-              <w:top w:val="single" w:sz="4" w:space="0" w:color="E4DED3"/>
-              <w:left w:val="single" w:sz="4" w:space="0" w:color="E4DED3"/>
-              <w:bottom w:val="single" w:sz="4" w:space="0" w:color="E4DED3"/>
-              <w:right w:val="single" w:sz="4" w:space="0" w:color="E4DED3"/>
-            </w:tcBorders>
-          </w:tcPr>
-          <w:p>
-            <w:r>
-              <w:rPr>
-                <w:color w:val="1F5A5C"/>
-                <w:sz w:val="18"/>
-              </w:rPr>
-              <w:t>the largest available saving, and it costs nothing in service</w:t>
+              <w:t>the tier scales down outside business hours, and capacity is scheduled against the intake calendar rather than held at peak all year</w:t>
+            </w:r>
+          </w:p>
+        </w:tc>
+        <w:tc>
+          <w:tcPr>
+            <w:tcW w:type="dxa" w:w="3489"/>
+            <w:tcBorders>
+              <w:top w:val="single" w:sz="4" w:space="0" w:color="E4DED3"/>
+              <w:left w:val="single" w:sz="4" w:space="0" w:color="E4DED3"/>
+              <w:bottom w:val="single" w:sz="4" w:space="0" w:color="E4DED3"/>
+              <w:right w:val="single" w:sz="4" w:space="0" w:color="E4DED3"/>
+            </w:tcBorders>
+          </w:tcPr>
+          <w:p>
+            <w:r>
+              <w:rPr>
+                <w:color w:val="1F5A5C"/>
+                <w:sz w:val="18"/>
+              </w:rPr>
+              <w:t>the largest available saving, and it costs nothing in service because the peaks are published months ahead</w:t>
             </w:r>
           </w:p>
         </w:tc>
@@ -9249,7 +9275,7 @@
           <w:color w:val="6B6660"/>
           <w:sz w:val="18"/>
         </w:rPr>
-        <w:t>the student proposes at least one genuine cost measure that suits a business-hours system (right-sizing, scheduled scale-down outside business hours, or accepting a slower recovery instead of a standby) and designs monitoring that maps onto the task 8 metrics. Monitoring that does not measure the stated goals has not met the item.</w:t>
+        <w:t>the student proposes at least one genuine cost measure that suits this system's actual shape — scheduled scale-down outside business hours, capacity scheduled against the academic calendar so peak size is not held for forty-six quiet weeks, storage lifecycle tiering under the retention obligation, or accepting a slower recovery instead of a standby — and designs monitoring that maps onto the task 8 metrics. The costing document states the tier is provisioned for the intake peak and held there all year; a student who proposes no measure touching that has missed the largest saving in front of them. Monitoring that does not measure the stated goals has not met the item.</w:t>
       </w:r>
     </w:p>
     <w:p>
@@ -9320,7 +9346,7 @@
             <w:color w:val="0563C1"/>
             <w:u w:val="single"/>
           </w:rPr>
-          <w:t>Accounting System Operational Costing — the current run cost, and the basis for your comparison</w:t>
+          <w:t>Enrolline Operational Costing — the current run cost, and the basis for your comparison</w:t>
         </w:r>
       </w:hyperlink>
     </w:p>
@@ -9643,7 +9669,7 @@
                 <w:color w:val="1F5A5C"/>
                 <w:sz w:val="18"/>
               </w:rPr>
-              <w:t>finance data encrypted in transit</w:t>
+              <w:t>student data encrypted in transit</w:t>
             </w:r>
           </w:p>
         </w:tc>
@@ -9825,7 +9851,7 @@
                 <w:color w:val="1F5A5C"/>
                 <w:sz w:val="18"/>
               </w:rPr>
-              <w:t>the system is genuinely idle overnight and at weekends</w:t>
+              <w:t>the system is genuinely idle overnight and at weekends, and outside the intake windows it carries about a third of its peak load on peak-sized capacity</w:t>
             </w:r>
           </w:p>
         </w:tc>
@@ -10099,7 +10125,7 @@
                 <w:color w:val="C5613B"/>
                 <w:sz w:val="19"/>
               </w:rPr>
-              <w:t>DIAGRAM — the improved Ledgerline architecture — both zones, every tier, and what is new</w:t>
+              <w:t>DIAGRAM — the improved Enrolline architecture — both zones, every tier, and what is new</w:t>
             </w:r>
           </w:p>
         </w:tc>
@@ -10237,7 +10263,7 @@
                 <w:color w:val="1F5A5C"/>
                 <w:sz w:val="19"/>
               </w:rPr>
-              <w:t>•  the database decision is argued at length — cost against recovery time, for a business-hours system with outsourced payroll</w:t>
+              <w:t>•  the database decision is argued at length — cost against recovery time, for a system that is quiet most of the year and cannot afford to be down inside an intake window</w:t>
             </w:r>
           </w:p>
           <w:p>
@@ -11632,7 +11658,7 @@
                 <w:color w:val="1F5A5C"/>
                 <w:sz w:val="19"/>
               </w:rPr>
-              <w:t>•  TLS for transport, and why it matters for a finance system on an internal network</w:t>
+              <w:t>•  TLS for transport, and why it matters for a system holding student identity evidence</w:t>
             </w:r>
           </w:p>
           <w:p>
@@ -11674,7 +11700,7 @@
                 <w:color w:val="1F5A5C"/>
                 <w:sz w:val="19"/>
               </w:rPr>
-              <w:t>•  block storage versus object storage, and why this system uses only the first</w:t>
+              <w:t>•  block storage for the instance and database, object storage for the document store — and which job each is doing here</w:t>
             </w:r>
           </w:p>
           <w:p>
@@ -11727,7 +11753,7 @@
           <w:color w:val="6B6660"/>
           <w:sz w:val="18"/>
         </w:rPr>
-        <w:t>real standards (TLS, HTTP, SQL, the availability-zone model) and real product categories (managed relational database, load balancer, auto scaling, block storage) are named and tied to the student's own design. A list with no connection to their architecture has not met the contextual bar.</w:t>
+        <w:t>real standards (TLS, HTTP, SQL, the availability-zone model) and real product categories (managed relational database, load balancer, auto scaling, block and object storage) are named and tied to the student's own design. A list with no connection to their architecture has not met the contextual bar.</w:t>
       </w:r>
     </w:p>
     <w:p>
@@ -11751,7 +11777,7 @@
         <w:rPr>
           <w:color w:val="1F5A5C"/>
         </w:rPr>
-        <w:t>Where would object storage be the right answer, and why not here?</w:t>
+        <w:t>Enrolline uses object storage. The website depends on it. What is the difference?</w:t>
       </w:r>
     </w:p>
     <w:p>
@@ -11764,7 +11790,7 @@
           <w:i w:val="0"/>
           <w:sz w:val="21"/>
         </w:rPr>
-        <w:t>Ledgerline uses no object storage. Contrast it with a system that depends on object storage for static content — the YAT public website is the obvious example — and explain how you would provision that storage and serve content from it if this system needed it.</w:t>
+        <w:t>Enrolline holds scanned student attachments in an S3 document store, but its system of record is the relational database. The YAT public website uses object storage differently again — it serves public static content from it. Explain how object storage is provisioned and content served from it, and set out what actually differs between those two uses, including what that difference means for how each system's storage should be configured.</w:t>
       </w:r>
     </w:p>
     <w:tbl>
@@ -11812,7 +11838,7 @@
                 <w:color w:val="1F5A5C"/>
                 <w:sz w:val="19"/>
               </w:rPr>
-              <w:t>•  static assets served straight from the store, with no server in the path</w:t>
+              <w:t>•  the bucket and object model, and addressing an object by key rather than by path on a disk</w:t>
             </w:r>
           </w:p>
           <w:p>
@@ -11826,7 +11852,7 @@
                 <w:color w:val="1F5A5C"/>
                 <w:sz w:val="19"/>
               </w:rPr>
-              <w:t>•  every instance sees the same content — the store is not tied to an instance</w:t>
+              <w:t>•  every instance sees the same content — the store is not tied to any one instance</w:t>
             </w:r>
           </w:p>
           <w:p>
@@ -11854,7 +11880,7 @@
                 <w:color w:val="1F5A5C"/>
                 <w:sz w:val="19"/>
               </w:rPr>
-              <w:t>•  fronting it with a content delivery network for a geographically spread audience</w:t>
+              <w:t>•  the website's use: public read, served directly or fronted by a content delivery network for a geographically spread audience</w:t>
             </w:r>
           </w:p>
           <w:p>
@@ -11868,7 +11894,21 @@
                 <w:color w:val="1F5A5C"/>
                 <w:sz w:val="19"/>
               </w:rPr>
-              <w:t>•  why Ledgerline gains nothing: an internal, dynamic, form-driven finance application with no static public content</w:t>
+              <w:t>•  Enrolline's use: private, blocked from public access, reached by the application over a private path, and carrying personal information</w:t>
+            </w:r>
+          </w:p>
+          <w:p>
+            <w:pPr>
+              <w:jc w:val="left"/>
+            </w:pPr>
+            <w:r>
+              <w:rPr>
+                <w:b w:val="0"/>
+                <w:i w:val="0"/>
+                <w:color w:val="1F5A5C"/>
+                <w:sz w:val="19"/>
+              </w:rPr>
+              <w:t>•  why the retention obligation drives lifecycle tiering rather than deletion — thirty years of attachments that are almost never read again, but can never be removed</w:t>
             </w:r>
           </w:p>
         </w:tc>
@@ -11907,7 +11947,7 @@
           <w:color w:val="6B6660"/>
           <w:sz w:val="18"/>
         </w:rPr>
-        <w:t>the student explains object storage for static content — durable, served independently of any instance, cheap per gigabyte, able to serve a static site directly or through a content delivery network — and correctly identifies that Ledgerline has no static public content and would gain nothing. Proposing object storage for Ledgerline anyway would fail IR-2 and should be marked accordingly.</w:t>
+        <w:t>the student explains object storage concretely — a bucket, objects addressed by key, durability, access control, storage classes, cost per gigabyte — and then draws the real distinction: the website serves objects PUBLICLY to end users (so it cares about public read access, a content delivery network in front, and cache behaviour), while Enrolline's store is PRIVATE and reached only by the application on behalf of a staff user (so it cares about blocked public access, a private network path, access logging, and lifecycle tiering under a long retention obligation). A student who treats the two as the same use, or who proposes public access or a CDN for Enrolline's student identity evidence, has not met the item — and the latter is a serious error, not a stylistic one.</w:t>
       </w:r>
     </w:p>
     <w:p>
@@ -11931,7 +11971,7 @@
         <w:rPr>
           <w:color w:val="1F5A5C"/>
         </w:rPr>
-        <w:t>What did cloud adoption change for Ledgerline, and what would migrating further change?</w:t>
+        <w:t>What did cloud adoption change for Enrolline, and what would migrating further change?</w:t>
       </w:r>
     </w:p>
     <w:p>
@@ -11944,7 +11984,7 @@
           <w:i w:val="0"/>
           <w:sz w:val="21"/>
         </w:rPr>
-        <w:t>Ledgerline moved from a server under a desk to a managed cloud environment. Explain what that change actually gave YAT, what it did not, and what principles would apply if YAT migrated more of this system — for instance to a fully managed or serverless model.</w:t>
+        <w:t>Enrolline moved from a server under a desk to a managed cloud environment. Explain what that change actually gave YAT, what it did not, and what principles would apply if YAT migrated more of this system — for instance to a fully managed or serverless model.</w:t>
       </w:r>
     </w:p>
     <w:tbl>
@@ -11992,7 +12032,7 @@
                 <w:color w:val="1F5A5C"/>
                 <w:sz w:val="19"/>
               </w:rPr>
-              <w:t>•  what was gained: managed database operations, elasticity for month-end, no hardware refresh cycle</w:t>
+              <w:t>•  what was gained: managed database operations, elasticity available for the intake peaks, no hardware refresh cycle</w:t>
             </w:r>
           </w:p>
           <w:p>
@@ -12048,7 +12088,7 @@
                 <w:color w:val="1F5A5C"/>
                 <w:sz w:val="19"/>
               </w:rPr>
-              <w:t>•  where a further move would and would not pay for an internal business-hours system</w:t>
+              <w:t>•  where a further move would and would not pay for a staff-facing system with two known annual peaks</w:t>
             </w:r>
           </w:p>
         </w:tc>

</xml_diff>

<commit_message>
S1-CL3: draw the Enrolline baseline topology and place it
Adds the diagram spec and renders it through the draw-diagram skill, so the
chain is spec -> .drawio -> .png with no hand export. Places it as Figure 4.4 in
the Baseline Solution Design, matching where the Ledgerline figure sits, and
adds it to AT1's resources — previously AT1 only linked the wider estate
diagram, in which Enrolline appeared in prose but in no figure.

No improved-state diagram: AT1 task 14 asks the student to draw it (PE 1), the
improvement is open so there is no canonical end state, and AT3 task 10 asks
them to document as-deployed against the approved design. CL1 has a before and
an after because its HA target is supplied; CL3 inverts that.

All CL3 gates re-run green; every student-facing link across AT1/AT2/AT3 and
every asset link verified against the built site.

Co-Authored-By: Claude Opus 5 (1M context) <noreply@anthropic.com>
</commit_message>
<xml_diff>
--- a/S1-CL3-Cloud-Infrastructure-Improvement/assessments/AT1/AT1-Design-Assessor.docx
+++ b/S1-CL3-Cloud-Infrastructure-Improvement/assessments/AT1/AT1-Design-Assessor.docx
@@ -2317,7 +2317,28 @@
             <w:color w:val="0563C1"/>
             <w:u w:val="single"/>
           </w:rPr>
-          <w:t>Network Diagram — the environment drawn out, including the campus it connects back to</w:t>
+          <w:t>Enrolline Network Diagram — the environment you are improving, drawn out</w:t>
+        </w:r>
+      </w:hyperlink>
+    </w:p>
+    <w:p>
+      <w:pPr>
+        <w:spacing w:after="80"/>
+      </w:pPr>
+      <w:r>
+        <w:rPr>
+          <w:sz w:val="21"/>
+        </w:rPr>
+        <w:t xml:space="preserve">•  </w:t>
+      </w:r>
+      <w:hyperlink r:id="rId24">
+        <w:r>
+          <w:rPr>
+            <w:sz w:val="21"/>
+            <w:color w:val="0563C1"/>
+            <w:u w:val="single"/>
+          </w:rPr>
+          <w:t>Network Diagram — the wider YAT environment Enrolline sits in, including the campus it connects back to</w:t>
         </w:r>
       </w:hyperlink>
     </w:p>
@@ -2440,7 +2461,7 @@
         </w:rPr>
         <w:t xml:space="preserve">•  </w:t>
       </w:r>
-      <w:hyperlink r:id="rId24">
+      <w:hyperlink r:id="rId25">
         <w:r>
           <w:rPr>
             <w:sz w:val="19"/>
@@ -2462,7 +2483,7 @@
         </w:rPr>
         <w:t xml:space="preserve">•  </w:t>
       </w:r>
-      <w:hyperlink r:id="rId23">
+      <w:hyperlink r:id="rId24">
         <w:r>
           <w:rPr>
             <w:sz w:val="19"/>
@@ -3682,7 +3703,7 @@
         </w:rPr>
         <w:t xml:space="preserve">•  </w:t>
       </w:r>
-      <w:hyperlink r:id="rId25">
+      <w:hyperlink r:id="rId26">
         <w:r>
           <w:rPr>
             <w:sz w:val="19"/>
@@ -4282,7 +4303,7 @@
         </w:rPr>
         <w:t xml:space="preserve">•  </w:t>
       </w:r>
-      <w:hyperlink r:id="rId26">
+      <w:hyperlink r:id="rId27">
         <w:r>
           <w:rPr>
             <w:sz w:val="19"/>
@@ -7719,7 +7740,7 @@
         </w:rPr>
         <w:t xml:space="preserve">•  </w:t>
       </w:r>
-      <w:hyperlink r:id="rId27">
+      <w:hyperlink r:id="rId28">
         <w:r>
           <w:rPr>
             <w:sz w:val="19"/>
@@ -7741,7 +7762,7 @@
         </w:rPr>
         <w:t xml:space="preserve">•  </w:t>
       </w:r>
-      <w:hyperlink r:id="rId28">
+      <w:hyperlink r:id="rId29">
         <w:r>
           <w:rPr>
             <w:sz w:val="19"/>

</xml_diff>